<commit_message>
Arduino Nano R4 移植 & KiCad ライブラリ統合
- Arduino Nano R4 (Renesas RA4M1) への移植完了
  * スケッチ: ESP32 → Nano R4 対応に変更
  * GPIO ピン: 再割り当て (GPIO21/22 → A4/A5 など)
  * ストレージ: Preferences → EEPROM に変更
  * リポジトリ名: PSN_TRX_ESP32 → PSN_TRX_Nano_R4

- KiCad シンボル・フットプリント作成
  * Arduino_Nano_R4_Socket (DIP 30)
  * Si5351A (QFN-20)
  * Si5351_DIP8 モジュール (DIP 8)
  * すべてピン位置を 2.54mm グリッドに整列

- ライブラリ統合
  * sym-lib-table に 4 つのシンボルライブラリ登録
  * fp-lib-table に フットプリント登録
  * 絶対パスに統一

- ドキュメント更新
  * PSN_TRX_VFO改造仕様書.docx に全変更内容を記録
  * ピン配置表、ライブラリ情報を追加

- VXO 回路変更
  * VXO 部分を別の回路に変更

Co-Authored-By: Claude Haiku 4.5 <noreply@anthropic.com>
</commit_message>
<xml_diff>
--- a/docs/PSN_TRX_VFO改造仕様書.docx
+++ b/docs/PSN_TRX_VFO改造仕様書.docx
@@ -19,7 +19,7 @@
         <w:rPr>
           <w:sz w:val="24"/>
         </w:rPr>
-        <w:t>PSN方式SSBトランシーバー  VXO→ESP32+Si5351 VFO 置き換え</w:t>
+        <w:t>PSN方式SSBトランシーバー  VXO→Arduino Nano R4+Si5351 VFO 置き換え</w:t>
       </w:r>
     </w:p>
     <w:p>
@@ -49,7 +49,7 @@
           <w:b w:val="0"/>
           <w:sz w:val="22"/>
         </w:rPr>
-        <w:t>既存のVXO（水晶発振器）およびRF PSNパッシブ回路を、ESP32マイコンとSi5351クロックジェネレーターを使ったVFOに置き換える。</w:t>
+        <w:t>既存のVXO（水晶発振器）およびRF PSNパッシブ回路を、Arduino Nano R4マイコンとSi5351クロックジェネレーターを使ったVFOに置き換える。</w:t>
       </w:r>
     </w:p>
     <w:p>
@@ -130,7 +130,7 @@
               <w:rPr>
                 <w:b/>
               </w:rPr>
-              <w:t>変更後（ESP32+Si5351）</w:t>
+              <w:t>変更後（Arduino Nano R4+Si5351）</w:t>
             </w:r>
           </w:p>
         </w:tc>
@@ -290,7 +290,7 @@
           </w:tcPr>
           <w:p>
             <w:r>
-              <w:t>NVS（電源OFF後も保持）</w:t>
+              <w:t>EEPROM（電源OFF後も保持）</w:t>
             </w:r>
           </w:p>
         </w:tc>
@@ -1221,7 +1221,7 @@
           </w:tcPr>
           <w:p>
             <w:r>
-              <w:t>ESP32 DevKit</w:t>
+              <w:t>Arduino Nano R4 DevKit</w:t>
             </w:r>
           </w:p>
         </w:tc>
@@ -1231,7 +1231,7 @@
           </w:tcPr>
           <w:p>
             <w:r>
-              <w:t>ESP32-WROOM-32等</w:t>
+              <w:t>Arduino Nano R4-WROOM-32等</w:t>
             </w:r>
           </w:p>
         </w:tc>
@@ -1567,7 +1567,7 @@
         <w:jc w:val="left"/>
       </w:pPr>
       <w:r>
-        <w:t>5.1 ESP32 ピン配置</w:t>
+        <w:t>5.1 Arduino Nano R4 ピン配置</w:t>
       </w:r>
     </w:p>
     <w:tbl>
@@ -1595,7 +1595,7 @@
               <w:rPr>
                 <w:b/>
               </w:rPr>
-              <w:t>ESP32 GPIO</w:t>
+              <w:t>Arduino Nano R4 GPIO</w:t>
             </w:r>
           </w:p>
         </w:tc>
@@ -1641,7 +1641,7 @@
           </w:tcPr>
           <w:p>
             <w:r>
-              <w:t>GPIO21 (SDA)</w:t>
+              <w:t>A4 (SDA)</w:t>
             </w:r>
           </w:p>
         </w:tc>
@@ -1673,7 +1673,7 @@
           </w:tcPr>
           <w:p>
             <w:r>
-              <w:t>GPIO22 (SCL)</w:t>
+              <w:t>A5 (SCL)</w:t>
             </w:r>
           </w:p>
         </w:tc>
@@ -1705,7 +1705,7 @@
           </w:tcPr>
           <w:p>
             <w:r>
-              <w:t>GPIO32</w:t>
+              <w:t>D2</w:t>
             </w:r>
           </w:p>
         </w:tc>
@@ -1735,7 +1735,7 @@
           </w:tcPr>
           <w:p>
             <w:r>
-              <w:t>GPIO33</w:t>
+              <w:t>D3</w:t>
             </w:r>
           </w:p>
         </w:tc>
@@ -1765,7 +1765,7 @@
           </w:tcPr>
           <w:p>
             <w:r>
-              <w:t>GPIO25</w:t>
+              <w:t>D4</w:t>
             </w:r>
           </w:p>
         </w:tc>
@@ -2345,7 +2345,7 @@
           </w:tcPr>
           <w:p>
             <w:r>
-              <w:t>ESP32 Dev Module</w:t>
+              <w:t>Arduino Nano R4 Dev Module</w:t>
             </w:r>
           </w:p>
         </w:tc>
@@ -2749,7 +2749,7 @@
           </w:tcPr>
           <w:p>
             <w:r>
-              <w:t>NVS（不揮発メモリ）に自動保存</w:t>
+              <w:t>EEPROM（不揮発メモリ）に自動保存</w:t>
             </w:r>
           </w:p>
         </w:tc>
@@ -4404,6 +4404,1744 @@
           <w:sz w:val="22"/>
         </w:rPr>
         <w:t>以上（9章追記）</w:t>
+      </w:r>
+    </w:p>
+    <w:p>
+      <w:pPr>
+        <w:pStyle w:val="Heading1"/>
+      </w:pPr>
+      <w:r>
+        <w:t>Arduino Nano R4 移植 &amp; KiCad ライブラリ統合</w:t>
+      </w:r>
+    </w:p>
+    <w:p>
+      <w:pPr>
+        <w:pStyle w:val="Heading2"/>
+      </w:pPr>
+      <w:r>
+        <w:t>1. Arduino Nano R4 への移植概要</w:t>
+      </w:r>
+    </w:p>
+    <w:p>
+      <w:r>
+        <w:t>PSN_TRX_ESP32 プロジェクトを Arduino Nano R4（ルネサス RA4M1 ベース）に移植しました。</w:t>
+      </w:r>
+    </w:p>
+    <w:p>
+      <w:r>
+        <w:t>主な変更：</w:t>
+      </w:r>
+    </w:p>
+    <w:p>
+      <w:pPr>
+        <w:pStyle w:val="ListBullet"/>
+      </w:pPr>
+      <w:r>
+        <w:t>マイコン: ESP32 → Arduino Nano R4 (Renesas RA4M1, 48MHz)</w:t>
+      </w:r>
+    </w:p>
+    <w:p>
+      <w:pPr>
+        <w:pStyle w:val="ListBullet"/>
+      </w:pPr>
+      <w:r>
+        <w:t>パッケージ: DIP 30 ピン（前世代 Nano との互換性あり）</w:t>
+      </w:r>
+    </w:p>
+    <w:p>
+      <w:pPr>
+        <w:pStyle w:val="ListBullet"/>
+      </w:pPr>
+      <w:r>
+        <w:t>ストレージ: Preferences (NVS) → EEPROM</w:t>
+      </w:r>
+    </w:p>
+    <w:p>
+      <w:pPr>
+        <w:pStyle w:val="ListBullet"/>
+      </w:pPr>
+      <w:r>
+        <w:t>I2C ピン: A4 (SDA), A5 (SCL) に固定</w:t>
+      </w:r>
+    </w:p>
+    <w:p>
+      <w:pPr>
+        <w:pStyle w:val="Heading2"/>
+      </w:pPr>
+      <w:r>
+        <w:t>2. GPIO ピン配置変更</w:t>
+      </w:r>
+    </w:p>
+    <w:p>
+      <w:r>
+        <w:t>ESP32 から Arduino Nano R4 への変更:</w:t>
+      </w:r>
+    </w:p>
+    <w:tbl>
+      <w:tblPr>
+        <w:tblStyle w:val="LightGrid-Accent1"/>
+        <w:tblW w:type="auto" w:w="0"/>
+        <w:tblLook w:firstColumn="1" w:firstRow="1" w:lastColumn="0" w:lastRow="0" w:noHBand="0" w:noVBand="1" w:val="04A0"/>
+      </w:tblPr>
+      <w:tblGrid>
+        <w:gridCol w:w="3024"/>
+        <w:gridCol w:w="3024"/>
+        <w:gridCol w:w="3024"/>
+      </w:tblGrid>
+      <w:tr>
+        <w:tc>
+          <w:tcPr>
+            <w:tcW w:type="dxa" w:w="3024"/>
+          </w:tcPr>
+          <w:p>
+            <w:r>
+              <w:t>機能</w:t>
+            </w:r>
+          </w:p>
+        </w:tc>
+        <w:tc>
+          <w:tcPr>
+            <w:tcW w:type="dxa" w:w="3024"/>
+          </w:tcPr>
+          <w:p>
+            <w:r>
+              <w:t>ESP32</w:t>
+            </w:r>
+          </w:p>
+        </w:tc>
+        <w:tc>
+          <w:tcPr>
+            <w:tcW w:type="dxa" w:w="3024"/>
+          </w:tcPr>
+          <w:p>
+            <w:r>
+              <w:t>Nano R4</w:t>
+            </w:r>
+          </w:p>
+        </w:tc>
+      </w:tr>
+      <w:tr>
+        <w:tc>
+          <w:tcPr>
+            <w:tcW w:type="dxa" w:w="3024"/>
+          </w:tcPr>
+          <w:p>
+            <w:r>
+              <w:t>I2C SDA</w:t>
+            </w:r>
+          </w:p>
+        </w:tc>
+        <w:tc>
+          <w:tcPr>
+            <w:tcW w:type="dxa" w:w="3024"/>
+          </w:tcPr>
+          <w:p>
+            <w:r>
+              <w:t>GPIO21</w:t>
+            </w:r>
+          </w:p>
+        </w:tc>
+        <w:tc>
+          <w:tcPr>
+            <w:tcW w:type="dxa" w:w="3024"/>
+          </w:tcPr>
+          <w:p>
+            <w:r>
+              <w:t>A4</w:t>
+            </w:r>
+          </w:p>
+        </w:tc>
+      </w:tr>
+      <w:tr>
+        <w:tc>
+          <w:tcPr>
+            <w:tcW w:type="dxa" w:w="3024"/>
+          </w:tcPr>
+          <w:p>
+            <w:r>
+              <w:t>I2C SCL</w:t>
+            </w:r>
+          </w:p>
+        </w:tc>
+        <w:tc>
+          <w:tcPr>
+            <w:tcW w:type="dxa" w:w="3024"/>
+          </w:tcPr>
+          <w:p>
+            <w:r>
+              <w:t>GPIO22</w:t>
+            </w:r>
+          </w:p>
+        </w:tc>
+        <w:tc>
+          <w:tcPr>
+            <w:tcW w:type="dxa" w:w="3024"/>
+          </w:tcPr>
+          <w:p>
+            <w:r>
+              <w:t>A5</w:t>
+            </w:r>
+          </w:p>
+        </w:tc>
+      </w:tr>
+      <w:tr>
+        <w:tc>
+          <w:tcPr>
+            <w:tcW w:type="dxa" w:w="3024"/>
+          </w:tcPr>
+          <w:p>
+            <w:r>
+              <w:t>エンコーダ A</w:t>
+            </w:r>
+          </w:p>
+        </w:tc>
+        <w:tc>
+          <w:tcPr>
+            <w:tcW w:type="dxa" w:w="3024"/>
+          </w:tcPr>
+          <w:p>
+            <w:r>
+              <w:t>GPIO32</w:t>
+            </w:r>
+          </w:p>
+        </w:tc>
+        <w:tc>
+          <w:tcPr>
+            <w:tcW w:type="dxa" w:w="3024"/>
+          </w:tcPr>
+          <w:p>
+            <w:r>
+              <w:t>D2</w:t>
+            </w:r>
+          </w:p>
+        </w:tc>
+      </w:tr>
+      <w:tr>
+        <w:tc>
+          <w:tcPr>
+            <w:tcW w:type="dxa" w:w="3024"/>
+          </w:tcPr>
+          <w:p>
+            <w:r>
+              <w:t>エンコーダ B</w:t>
+            </w:r>
+          </w:p>
+        </w:tc>
+        <w:tc>
+          <w:tcPr>
+            <w:tcW w:type="dxa" w:w="3024"/>
+          </w:tcPr>
+          <w:p>
+            <w:r>
+              <w:t>GPIO33</w:t>
+            </w:r>
+          </w:p>
+        </w:tc>
+        <w:tc>
+          <w:tcPr>
+            <w:tcW w:type="dxa" w:w="3024"/>
+          </w:tcPr>
+          <w:p>
+            <w:r>
+              <w:t>D3</w:t>
+            </w:r>
+          </w:p>
+        </w:tc>
+      </w:tr>
+      <w:tr>
+        <w:tc>
+          <w:tcPr>
+            <w:tcW w:type="dxa" w:w="3024"/>
+          </w:tcPr>
+          <w:p>
+            <w:r>
+              <w:t>エンコーダ SW</w:t>
+            </w:r>
+          </w:p>
+        </w:tc>
+        <w:tc>
+          <w:tcPr>
+            <w:tcW w:type="dxa" w:w="3024"/>
+          </w:tcPr>
+          <w:p>
+            <w:r>
+              <w:t>GPIO25</w:t>
+            </w:r>
+          </w:p>
+        </w:tc>
+        <w:tc>
+          <w:tcPr>
+            <w:tcW w:type="dxa" w:w="3024"/>
+          </w:tcPr>
+          <w:p>
+            <w:r>
+              <w:t>D4</w:t>
+            </w:r>
+          </w:p>
+        </w:tc>
+      </w:tr>
+    </w:tbl>
+    <w:p>
+      <w:pPr>
+        <w:pStyle w:val="Heading2"/>
+      </w:pPr>
+      <w:r>
+        <w:t>3. KiCad シンボル・フットプリント</w:t>
+      </w:r>
+    </w:p>
+    <w:p>
+      <w:pPr>
+        <w:pStyle w:val="Heading3"/>
+      </w:pPr>
+      <w:r>
+        <w:t>3.1 Arduino Nano R4 (DIP 30)</w:t>
+      </w:r>
+    </w:p>
+    <w:p>
+      <w:r>
+        <w:rPr>
+          <w:b/>
+        </w:rPr>
+        <w:t xml:space="preserve">シンボル: </w:t>
+      </w:r>
+      <w:r>
+        <w:t>Arduino_Nano_R4.kicad_sym</w:t>
+        <w:br/>
+      </w:r>
+      <w:r>
+        <w:rPr>
+          <w:b/>
+        </w:rPr>
+        <w:t xml:space="preserve">フットプリント: </w:t>
+      </w:r>
+      <w:r>
+        <w:t>Arduino_Nano_R4_Socket.kicad_mod</w:t>
+        <w:br/>
+      </w:r>
+      <w:r>
+        <w:rPr>
+          <w:b/>
+        </w:rPr>
+        <w:t xml:space="preserve">パッケージ: </w:t>
+      </w:r>
+      <w:r>
+        <w:t>DIP 30 ピン、スルーホール</w:t>
+        <w:br/>
+      </w:r>
+    </w:p>
+    <w:p>
+      <w:pPr>
+        <w:pStyle w:val="ListBullet"/>
+      </w:pPr>
+      <w:r>
+        <w:t>ピン機能:</w:t>
+      </w:r>
+    </w:p>
+    <w:p>
+      <w:pPr>
+        <w:pStyle w:val="ListBullet2"/>
+      </w:pPr>
+      <w:r>
+        <w:t>D0-D13: デジタル I/O (14 ピン)</w:t>
+      </w:r>
+    </w:p>
+    <w:p>
+      <w:pPr>
+        <w:pStyle w:val="ListBullet2"/>
+      </w:pPr>
+      <w:r>
+        <w:t>A0-A7: アナログ入力 (8 ピン)</w:t>
+      </w:r>
+    </w:p>
+    <w:p>
+      <w:pPr>
+        <w:pStyle w:val="ListBullet2"/>
+      </w:pPr>
+      <w:r>
+        <w:t>5V, 3.3V, GND: 電源</w:t>
+      </w:r>
+    </w:p>
+    <w:p>
+      <w:pPr>
+        <w:pStyle w:val="Heading3"/>
+      </w:pPr>
+      <w:r>
+        <w:t>3.2 Si5351A QFN-20</w:t>
+      </w:r>
+    </w:p>
+    <w:p>
+      <w:r>
+        <w:rPr>
+          <w:b/>
+        </w:rPr>
+        <w:t xml:space="preserve">シンボル: </w:t>
+      </w:r>
+      <w:r>
+        <w:t>Si5351A.kicad_sym</w:t>
+        <w:br/>
+      </w:r>
+      <w:r>
+        <w:rPr>
+          <w:b/>
+        </w:rPr>
+        <w:t xml:space="preserve">フットプリント: </w:t>
+      </w:r>
+      <w:r>
+        <w:t>Si5351A_QFN-20.kicad_mod</w:t>
+        <w:br/>
+      </w:r>
+      <w:r>
+        <w:rPr>
+          <w:b/>
+        </w:rPr>
+        <w:t xml:space="preserve">パッケージ: </w:t>
+      </w:r>
+      <w:r>
+        <w:t>QFN-20 (4x4mm, 0.5mm ピッチ)</w:t>
+        <w:br/>
+      </w:r>
+    </w:p>
+    <w:p>
+      <w:pPr>
+        <w:pStyle w:val="ListBullet"/>
+      </w:pPr>
+      <w:r>
+        <w:t>ピン機能:</w:t>
+      </w:r>
+    </w:p>
+    <w:p>
+      <w:pPr>
+        <w:pStyle w:val="ListBullet2"/>
+      </w:pPr>
+      <w:r>
+        <w:t>CLK0-CLK3: クロック出力 (4 チャネル)</w:t>
+      </w:r>
+    </w:p>
+    <w:p>
+      <w:pPr>
+        <w:pStyle w:val="ListBullet2"/>
+      </w:pPr>
+      <w:r>
+        <w:t>SDA/SCL: I2C インターフェース</w:t>
+      </w:r>
+    </w:p>
+    <w:p>
+      <w:pPr>
+        <w:pStyle w:val="ListBullet2"/>
+      </w:pPr>
+      <w:r>
+        <w:t>XA/XB: クリスタル接続</w:t>
+      </w:r>
+    </w:p>
+    <w:p>
+      <w:pPr>
+        <w:pStyle w:val="ListBullet2"/>
+      </w:pPr>
+      <w:r>
+        <w:t>VDDA/VCCIO: 電源</w:t>
+      </w:r>
+    </w:p>
+    <w:p>
+      <w:pPr>
+        <w:pStyle w:val="Heading3"/>
+      </w:pPr>
+      <w:r>
+        <w:t>3.3 Si5351 DIP-8 モジュール</w:t>
+      </w:r>
+    </w:p>
+    <w:p>
+      <w:r>
+        <w:rPr>
+          <w:b/>
+        </w:rPr>
+        <w:t xml:space="preserve">シンボル: </w:t>
+      </w:r>
+      <w:r>
+        <w:t>Si5351_DIP8.kicad_sym (1.5倍拡大)</w:t>
+        <w:br/>
+      </w:r>
+      <w:r>
+        <w:rPr>
+          <w:b/>
+        </w:rPr>
+        <w:t xml:space="preserve">フットプリント: </w:t>
+      </w:r>
+      <w:r>
+        <w:t>DIP-8_W7.62mm.kicad_mod</w:t>
+        <w:br/>
+      </w:r>
+      <w:r>
+        <w:rPr>
+          <w:b/>
+        </w:rPr>
+        <w:t xml:space="preserve">パッケージ: </w:t>
+      </w:r>
+      <w:r>
+        <w:t>DIP-8 (7.62mm ピッチ)</w:t>
+        <w:br/>
+      </w:r>
+    </w:p>
+    <w:p>
+      <w:r>
+        <w:t>ピン配置:</w:t>
+      </w:r>
+    </w:p>
+    <w:tbl>
+      <w:tblPr>
+        <w:tblStyle w:val="LightGrid-Accent1"/>
+        <w:tblW w:type="auto" w:w="0"/>
+        <w:tblLook w:firstColumn="1" w:firstRow="1" w:lastColumn="0" w:lastRow="0" w:noHBand="0" w:noVBand="1" w:val="04A0"/>
+      </w:tblPr>
+      <w:tblGrid>
+        <w:gridCol w:w="4536"/>
+        <w:gridCol w:w="4536"/>
+      </w:tblGrid>
+      <w:tr>
+        <w:tc>
+          <w:tcPr>
+            <w:tcW w:type="dxa" w:w="4536"/>
+          </w:tcPr>
+          <w:p>
+            <w:r>
+              <w:t>ピン番号</w:t>
+            </w:r>
+          </w:p>
+        </w:tc>
+        <w:tc>
+          <w:tcPr>
+            <w:tcW w:type="dxa" w:w="4536"/>
+          </w:tcPr>
+          <w:p>
+            <w:r>
+              <w:t>機能</w:t>
+            </w:r>
+          </w:p>
+        </w:tc>
+      </w:tr>
+      <w:tr>
+        <w:tc>
+          <w:tcPr>
+            <w:tcW w:type="dxa" w:w="4536"/>
+          </w:tcPr>
+          <w:p>
+            <w:r>
+              <w:t>1</w:t>
+            </w:r>
+          </w:p>
+        </w:tc>
+        <w:tc>
+          <w:tcPr>
+            <w:tcW w:type="dxa" w:w="4536"/>
+          </w:tcPr>
+          <w:p>
+            <w:r>
+              <w:t>VDDO - 出力バッファ用電源</w:t>
+            </w:r>
+          </w:p>
+        </w:tc>
+      </w:tr>
+      <w:tr>
+        <w:tc>
+          <w:tcPr>
+            <w:tcW w:type="dxa" w:w="4536"/>
+          </w:tcPr>
+          <w:p>
+            <w:r>
+              <w:t>2</w:t>
+            </w:r>
+          </w:p>
+        </w:tc>
+        <w:tc>
+          <w:tcPr>
+            <w:tcW w:type="dxa" w:w="4536"/>
+          </w:tcPr>
+          <w:p>
+            <w:r>
+              <w:t>SCL - I2C クロック入力</w:t>
+            </w:r>
+          </w:p>
+        </w:tc>
+      </w:tr>
+      <w:tr>
+        <w:tc>
+          <w:tcPr>
+            <w:tcW w:type="dxa" w:w="4536"/>
+          </w:tcPr>
+          <w:p>
+            <w:r>
+              <w:t>3</w:t>
+            </w:r>
+          </w:p>
+        </w:tc>
+        <w:tc>
+          <w:tcPr>
+            <w:tcW w:type="dxa" w:w="4536"/>
+          </w:tcPr>
+          <w:p>
+            <w:r>
+              <w:t>SDA - I2C データ入出力</w:t>
+            </w:r>
+          </w:p>
+        </w:tc>
+      </w:tr>
+      <w:tr>
+        <w:tc>
+          <w:tcPr>
+            <w:tcW w:type="dxa" w:w="4536"/>
+          </w:tcPr>
+          <w:p>
+            <w:r>
+              <w:t>4</w:t>
+            </w:r>
+          </w:p>
+        </w:tc>
+        <w:tc>
+          <w:tcPr>
+            <w:tcW w:type="dxa" w:w="4536"/>
+          </w:tcPr>
+          <w:p>
+            <w:r>
+              <w:t>GND - グラウンド</w:t>
+            </w:r>
+          </w:p>
+        </w:tc>
+      </w:tr>
+    </w:tbl>
+    <w:p>
+      <w:r>
+        <w:t>ピン配置（続き）:</w:t>
+      </w:r>
+    </w:p>
+    <w:tbl>
+      <w:tblPr>
+        <w:tblStyle w:val="LightGrid-Accent1"/>
+        <w:tblW w:type="auto" w:w="0"/>
+        <w:tblLook w:firstColumn="1" w:firstRow="1" w:lastColumn="0" w:lastRow="0" w:noHBand="0" w:noVBand="1" w:val="04A0"/>
+      </w:tblPr>
+      <w:tblGrid>
+        <w:gridCol w:w="4536"/>
+        <w:gridCol w:w="4536"/>
+      </w:tblGrid>
+      <w:tr>
+        <w:tc>
+          <w:tcPr>
+            <w:tcW w:type="dxa" w:w="4536"/>
+          </w:tcPr>
+          <w:p>
+            <w:r>
+              <w:t>ピン番号</w:t>
+            </w:r>
+          </w:p>
+        </w:tc>
+        <w:tc>
+          <w:tcPr>
+            <w:tcW w:type="dxa" w:w="4536"/>
+          </w:tcPr>
+          <w:p>
+            <w:r>
+              <w:t>機能</w:t>
+            </w:r>
+          </w:p>
+        </w:tc>
+      </w:tr>
+      <w:tr>
+        <w:tc>
+          <w:tcPr>
+            <w:tcW w:type="dxa" w:w="4536"/>
+          </w:tcPr>
+          <w:p>
+            <w:r>
+              <w:t>5</w:t>
+            </w:r>
+          </w:p>
+        </w:tc>
+        <w:tc>
+          <w:tcPr>
+            <w:tcW w:type="dxa" w:w="4536"/>
+          </w:tcPr>
+          <w:p>
+            <w:r>
+              <w:t>CLK0 - クロック出力 1</w:t>
+            </w:r>
+          </w:p>
+        </w:tc>
+      </w:tr>
+      <w:tr>
+        <w:tc>
+          <w:tcPr>
+            <w:tcW w:type="dxa" w:w="4536"/>
+          </w:tcPr>
+          <w:p>
+            <w:r>
+              <w:t>6</w:t>
+            </w:r>
+          </w:p>
+        </w:tc>
+        <w:tc>
+          <w:tcPr>
+            <w:tcW w:type="dxa" w:w="4536"/>
+          </w:tcPr>
+          <w:p>
+            <w:r>
+              <w:t>CLK1 - クロック出力 2</w:t>
+            </w:r>
+          </w:p>
+        </w:tc>
+      </w:tr>
+      <w:tr>
+        <w:tc>
+          <w:tcPr>
+            <w:tcW w:type="dxa" w:w="4536"/>
+          </w:tcPr>
+          <w:p>
+            <w:r>
+              <w:t>7</w:t>
+            </w:r>
+          </w:p>
+        </w:tc>
+        <w:tc>
+          <w:tcPr>
+            <w:tcW w:type="dxa" w:w="4536"/>
+          </w:tcPr>
+          <w:p>
+            <w:r>
+              <w:t>CLK2 - クロック出力 3</w:t>
+            </w:r>
+          </w:p>
+        </w:tc>
+      </w:tr>
+      <w:tr>
+        <w:tc>
+          <w:tcPr>
+            <w:tcW w:type="dxa" w:w="4536"/>
+          </w:tcPr>
+          <w:p>
+            <w:r>
+              <w:t>8</w:t>
+            </w:r>
+          </w:p>
+        </w:tc>
+        <w:tc>
+          <w:tcPr>
+            <w:tcW w:type="dxa" w:w="4536"/>
+          </w:tcPr>
+          <w:p>
+            <w:r>
+              <w:t>VDD - コア電源入力</w:t>
+            </w:r>
+          </w:p>
+        </w:tc>
+      </w:tr>
+    </w:tbl>
+    <w:p>
+      <w:pPr>
+        <w:pStyle w:val="Heading2"/>
+      </w:pPr>
+      <w:r>
+        <w:t>4. KiCad ライブラリ統合</w:t>
+      </w:r>
+    </w:p>
+    <w:p>
+      <w:r>
+        <w:t>sym-lib-table（シンボルライブラリ）に以下を登録:</w:t>
+      </w:r>
+    </w:p>
+    <w:p>
+      <w:pPr>
+        <w:pStyle w:val="ListBullet"/>
+      </w:pPr>
+      <w:r>
+        <w:t>PSN_TRX - プロジェクト用カスタムシンボル</w:t>
+      </w:r>
+    </w:p>
+    <w:p>
+      <w:pPr>
+        <w:pStyle w:val="ListBullet"/>
+      </w:pPr>
+      <w:r>
+        <w:t>Arduino_Nano_R4 - Arduino Nano R4 シンボル</w:t>
+      </w:r>
+    </w:p>
+    <w:p>
+      <w:pPr>
+        <w:pStyle w:val="ListBullet"/>
+      </w:pPr>
+      <w:r>
+        <w:t>Si5351A - Si5351A QFN-20 シンボル</w:t>
+      </w:r>
+    </w:p>
+    <w:p>
+      <w:pPr>
+        <w:pStyle w:val="ListBullet"/>
+      </w:pPr>
+      <w:r>
+        <w:t>Si5351_DIP8 - Si5351 DIP-8 モジュールシンボル</w:t>
+      </w:r>
+    </w:p>
+    <w:p>
+      <w:pPr>
+        <w:pStyle w:val="ListBullet"/>
+      </w:pPr>
+      <w:r>
+        <w:t>Arduino - Arduino 公式ボードライブラリ</w:t>
+      </w:r>
+    </w:p>
+    <w:p>
+      <w:r>
+        <w:br/>
+        <w:t>fp-lib-table（フットプリントライブラリ）に以下を登録:</w:t>
+      </w:r>
+    </w:p>
+    <w:p>
+      <w:pPr>
+        <w:pStyle w:val="ListBullet"/>
+      </w:pPr>
+      <w:r>
+        <w:t>PSN_TRX.pretty - プロジェクト用フットプリント</w:t>
+      </w:r>
+    </w:p>
+    <w:p>
+      <w:pPr>
+        <w:pStyle w:val="ListBullet"/>
+      </w:pPr>
+      <w:r>
+        <w:t>Arduino - Arduino 公式フットプリント</w:t>
+      </w:r>
+    </w:p>
+    <w:p>
+      <w:pPr>
+        <w:pStyle w:val="Heading2"/>
+      </w:pPr>
+      <w:r>
+        <w:t>5. 作成・更新ファイル一覧</w:t>
+      </w:r>
+    </w:p>
+    <w:p>
+      <w:r>
+        <w:t>シンボルファイル:</w:t>
+      </w:r>
+    </w:p>
+    <w:p>
+      <w:pPr>
+        <w:pStyle w:val="ListBullet"/>
+      </w:pPr>
+      <w:r>
+        <w:t>Arduino_Nano_R4.kicad_sym (7.2 KB)</w:t>
+      </w:r>
+    </w:p>
+    <w:p>
+      <w:pPr>
+        <w:pStyle w:val="ListBullet"/>
+      </w:pPr>
+      <w:r>
+        <w:t>Si5351A.kicad_sym (5.2 KB)</w:t>
+      </w:r>
+    </w:p>
+    <w:p>
+      <w:pPr>
+        <w:pStyle w:val="ListBullet"/>
+      </w:pPr>
+      <w:r>
+        <w:t>Si5351_DIP8.kicad_sym (2.8 KB)</w:t>
+      </w:r>
+    </w:p>
+    <w:p>
+      <w:r>
+        <w:br/>
+        <w:t>フットプリントファイル:</w:t>
+      </w:r>
+    </w:p>
+    <w:p>
+      <w:pPr>
+        <w:pStyle w:val="ListBullet"/>
+      </w:pPr>
+      <w:r>
+        <w:t>Arduino_Nano_R4_Socket.kicad_mod (4.4 KB)</w:t>
+      </w:r>
+    </w:p>
+    <w:p>
+      <w:pPr>
+        <w:pStyle w:val="ListBullet"/>
+      </w:pPr>
+      <w:r>
+        <w:t>Si5351A_QFN-20.kicad_mod (3.0 KB)</w:t>
+      </w:r>
+    </w:p>
+    <w:p>
+      <w:pPr>
+        <w:pStyle w:val="ListBullet"/>
+      </w:pPr>
+      <w:r>
+        <w:t>DIP-8_W7.62mm.kicad_mod (2.0 KB)</w:t>
+      </w:r>
+    </w:p>
+    <w:p>
+      <w:pPr>
+        <w:pStyle w:val="Heading1"/>
+      </w:pPr>
+      <w:r>
+        <w:t>Arduino Nano R4 移植 &amp; KiCad ライブラリ統合</w:t>
+      </w:r>
+    </w:p>
+    <w:p>
+      <w:pPr>
+        <w:pStyle w:val="Heading2"/>
+      </w:pPr>
+      <w:r>
+        <w:t>1. Arduino Nano R4 への移植概要</w:t>
+      </w:r>
+    </w:p>
+    <w:p>
+      <w:r>
+        <w:t>PSN_TRX_ESP32 プロジェクトを Arduino Nano R4（ルネサス RA4M1 ベース）に移植しました。</w:t>
+      </w:r>
+    </w:p>
+    <w:p>
+      <w:r>
+        <w:t>主な変更：</w:t>
+      </w:r>
+    </w:p>
+    <w:p>
+      <w:pPr>
+        <w:pStyle w:val="ListBullet"/>
+      </w:pPr>
+      <w:r>
+        <w:t>マイコン: ESP32 → Arduino Nano R4 (Renesas RA4M1, 48MHz)</w:t>
+      </w:r>
+    </w:p>
+    <w:p>
+      <w:pPr>
+        <w:pStyle w:val="ListBullet"/>
+      </w:pPr>
+      <w:r>
+        <w:t>パッケージ: DIP 30 ピン（前世代 Nano との互換性あり）</w:t>
+      </w:r>
+    </w:p>
+    <w:p>
+      <w:pPr>
+        <w:pStyle w:val="ListBullet"/>
+      </w:pPr>
+      <w:r>
+        <w:t>ストレージ: Preferences (NVS) → EEPROM</w:t>
+      </w:r>
+    </w:p>
+    <w:p>
+      <w:pPr>
+        <w:pStyle w:val="ListBullet"/>
+      </w:pPr>
+      <w:r>
+        <w:t>I2C ピン: A4 (SDA), A5 (SCL) に固定</w:t>
+      </w:r>
+    </w:p>
+    <w:p>
+      <w:pPr>
+        <w:pStyle w:val="Heading2"/>
+      </w:pPr>
+      <w:r>
+        <w:t>2. GPIO ピン配置変更</w:t>
+      </w:r>
+    </w:p>
+    <w:p>
+      <w:r>
+        <w:t>ESP32 から Arduino Nano R4 への変更:</w:t>
+      </w:r>
+    </w:p>
+    <w:tbl>
+      <w:tblPr>
+        <w:tblStyle w:val="LightGrid-Accent1"/>
+        <w:tblW w:type="auto" w:w="0"/>
+        <w:tblLook w:firstColumn="1" w:firstRow="1" w:lastColumn="0" w:lastRow="0" w:noHBand="0" w:noVBand="1" w:val="04A0"/>
+      </w:tblPr>
+      <w:tblGrid>
+        <w:gridCol w:w="3024"/>
+        <w:gridCol w:w="3024"/>
+        <w:gridCol w:w="3024"/>
+      </w:tblGrid>
+      <w:tr>
+        <w:tc>
+          <w:tcPr>
+            <w:tcW w:type="dxa" w:w="3024"/>
+          </w:tcPr>
+          <w:p>
+            <w:r>
+              <w:t>機能</w:t>
+            </w:r>
+          </w:p>
+        </w:tc>
+        <w:tc>
+          <w:tcPr>
+            <w:tcW w:type="dxa" w:w="3024"/>
+          </w:tcPr>
+          <w:p>
+            <w:r>
+              <w:t>ESP32</w:t>
+            </w:r>
+          </w:p>
+        </w:tc>
+        <w:tc>
+          <w:tcPr>
+            <w:tcW w:type="dxa" w:w="3024"/>
+          </w:tcPr>
+          <w:p>
+            <w:r>
+              <w:t>Nano R4</w:t>
+            </w:r>
+          </w:p>
+        </w:tc>
+      </w:tr>
+      <w:tr>
+        <w:tc>
+          <w:tcPr>
+            <w:tcW w:type="dxa" w:w="3024"/>
+          </w:tcPr>
+          <w:p>
+            <w:r>
+              <w:t>I2C SDA</w:t>
+            </w:r>
+          </w:p>
+        </w:tc>
+        <w:tc>
+          <w:tcPr>
+            <w:tcW w:type="dxa" w:w="3024"/>
+          </w:tcPr>
+          <w:p>
+            <w:r>
+              <w:t>GPIO21</w:t>
+            </w:r>
+          </w:p>
+        </w:tc>
+        <w:tc>
+          <w:tcPr>
+            <w:tcW w:type="dxa" w:w="3024"/>
+          </w:tcPr>
+          <w:p>
+            <w:r>
+              <w:t>A4</w:t>
+            </w:r>
+          </w:p>
+        </w:tc>
+      </w:tr>
+      <w:tr>
+        <w:tc>
+          <w:tcPr>
+            <w:tcW w:type="dxa" w:w="3024"/>
+          </w:tcPr>
+          <w:p>
+            <w:r>
+              <w:t>I2C SCL</w:t>
+            </w:r>
+          </w:p>
+        </w:tc>
+        <w:tc>
+          <w:tcPr>
+            <w:tcW w:type="dxa" w:w="3024"/>
+          </w:tcPr>
+          <w:p>
+            <w:r>
+              <w:t>GPIO22</w:t>
+            </w:r>
+          </w:p>
+        </w:tc>
+        <w:tc>
+          <w:tcPr>
+            <w:tcW w:type="dxa" w:w="3024"/>
+          </w:tcPr>
+          <w:p>
+            <w:r>
+              <w:t>A5</w:t>
+            </w:r>
+          </w:p>
+        </w:tc>
+      </w:tr>
+      <w:tr>
+        <w:tc>
+          <w:tcPr>
+            <w:tcW w:type="dxa" w:w="3024"/>
+          </w:tcPr>
+          <w:p>
+            <w:r>
+              <w:t>エンコーダ A</w:t>
+            </w:r>
+          </w:p>
+        </w:tc>
+        <w:tc>
+          <w:tcPr>
+            <w:tcW w:type="dxa" w:w="3024"/>
+          </w:tcPr>
+          <w:p>
+            <w:r>
+              <w:t>GPIO32</w:t>
+            </w:r>
+          </w:p>
+        </w:tc>
+        <w:tc>
+          <w:tcPr>
+            <w:tcW w:type="dxa" w:w="3024"/>
+          </w:tcPr>
+          <w:p>
+            <w:r>
+              <w:t>D2</w:t>
+            </w:r>
+          </w:p>
+        </w:tc>
+      </w:tr>
+      <w:tr>
+        <w:tc>
+          <w:tcPr>
+            <w:tcW w:type="dxa" w:w="3024"/>
+          </w:tcPr>
+          <w:p>
+            <w:r>
+              <w:t>エンコーダ B</w:t>
+            </w:r>
+          </w:p>
+        </w:tc>
+        <w:tc>
+          <w:tcPr>
+            <w:tcW w:type="dxa" w:w="3024"/>
+          </w:tcPr>
+          <w:p>
+            <w:r>
+              <w:t>GPIO33</w:t>
+            </w:r>
+          </w:p>
+        </w:tc>
+        <w:tc>
+          <w:tcPr>
+            <w:tcW w:type="dxa" w:w="3024"/>
+          </w:tcPr>
+          <w:p>
+            <w:r>
+              <w:t>D3</w:t>
+            </w:r>
+          </w:p>
+        </w:tc>
+      </w:tr>
+      <w:tr>
+        <w:tc>
+          <w:tcPr>
+            <w:tcW w:type="dxa" w:w="3024"/>
+          </w:tcPr>
+          <w:p>
+            <w:r>
+              <w:t>エンコーダ SW</w:t>
+            </w:r>
+          </w:p>
+        </w:tc>
+        <w:tc>
+          <w:tcPr>
+            <w:tcW w:type="dxa" w:w="3024"/>
+          </w:tcPr>
+          <w:p>
+            <w:r>
+              <w:t>GPIO25</w:t>
+            </w:r>
+          </w:p>
+        </w:tc>
+        <w:tc>
+          <w:tcPr>
+            <w:tcW w:type="dxa" w:w="3024"/>
+          </w:tcPr>
+          <w:p>
+            <w:r>
+              <w:t>D4</w:t>
+            </w:r>
+          </w:p>
+        </w:tc>
+      </w:tr>
+    </w:tbl>
+    <w:p>
+      <w:pPr>
+        <w:pStyle w:val="Heading2"/>
+      </w:pPr>
+      <w:r>
+        <w:t>3. KiCad シンボル・フットプリント</w:t>
+      </w:r>
+    </w:p>
+    <w:p>
+      <w:pPr>
+        <w:pStyle w:val="Heading3"/>
+      </w:pPr>
+      <w:r>
+        <w:t>3.1 Arduino Nano R4 (DIP 30)</w:t>
+      </w:r>
+    </w:p>
+    <w:p>
+      <w:r>
+        <w:rPr>
+          <w:b/>
+        </w:rPr>
+        <w:t xml:space="preserve">シンボル: </w:t>
+      </w:r>
+      <w:r>
+        <w:t>Arduino_Nano_R4.kicad_sym</w:t>
+        <w:br/>
+      </w:r>
+      <w:r>
+        <w:rPr>
+          <w:b/>
+        </w:rPr>
+        <w:t xml:space="preserve">フットプリント: </w:t>
+      </w:r>
+      <w:r>
+        <w:t>Arduino_Nano_R4_Socket.kicad_mod</w:t>
+        <w:br/>
+      </w:r>
+      <w:r>
+        <w:rPr>
+          <w:b/>
+        </w:rPr>
+        <w:t xml:space="preserve">パッケージ: </w:t>
+      </w:r>
+      <w:r>
+        <w:t>DIP 30 ピン、スルーホール</w:t>
+        <w:br/>
+      </w:r>
+    </w:p>
+    <w:p>
+      <w:pPr>
+        <w:pStyle w:val="ListBullet"/>
+      </w:pPr>
+      <w:r>
+        <w:t>ピン機能:</w:t>
+      </w:r>
+    </w:p>
+    <w:p>
+      <w:pPr>
+        <w:pStyle w:val="ListBullet2"/>
+      </w:pPr>
+      <w:r>
+        <w:t>D0-D13: デジタル I/O (14 ピン)</w:t>
+      </w:r>
+    </w:p>
+    <w:p>
+      <w:pPr>
+        <w:pStyle w:val="ListBullet2"/>
+      </w:pPr>
+      <w:r>
+        <w:t>A0-A7: アナログ入力 (8 ピン)</w:t>
+      </w:r>
+    </w:p>
+    <w:p>
+      <w:pPr>
+        <w:pStyle w:val="ListBullet2"/>
+      </w:pPr>
+      <w:r>
+        <w:t>5V, 3.3V, GND: 電源</w:t>
+      </w:r>
+    </w:p>
+    <w:p>
+      <w:pPr>
+        <w:pStyle w:val="Heading3"/>
+      </w:pPr>
+      <w:r>
+        <w:t>3.2 Si5351A QFN-20</w:t>
+      </w:r>
+    </w:p>
+    <w:p>
+      <w:r>
+        <w:rPr>
+          <w:b/>
+        </w:rPr>
+        <w:t xml:space="preserve">シンボル: </w:t>
+      </w:r>
+      <w:r>
+        <w:t>Si5351A.kicad_sym</w:t>
+        <w:br/>
+      </w:r>
+      <w:r>
+        <w:rPr>
+          <w:b/>
+        </w:rPr>
+        <w:t xml:space="preserve">フットプリント: </w:t>
+      </w:r>
+      <w:r>
+        <w:t>Si5351A_QFN-20.kicad_mod</w:t>
+        <w:br/>
+      </w:r>
+      <w:r>
+        <w:rPr>
+          <w:b/>
+        </w:rPr>
+        <w:t xml:space="preserve">パッケージ: </w:t>
+      </w:r>
+      <w:r>
+        <w:t>QFN-20 (4x4mm, 0.5mm ピッチ)</w:t>
+        <w:br/>
+      </w:r>
+    </w:p>
+    <w:p>
+      <w:pPr>
+        <w:pStyle w:val="ListBullet"/>
+      </w:pPr>
+      <w:r>
+        <w:t>ピン機能:</w:t>
+      </w:r>
+    </w:p>
+    <w:p>
+      <w:pPr>
+        <w:pStyle w:val="ListBullet2"/>
+      </w:pPr>
+      <w:r>
+        <w:t>CLK0-CLK3: クロック出力 (4 チャネル)</w:t>
+      </w:r>
+    </w:p>
+    <w:p>
+      <w:pPr>
+        <w:pStyle w:val="ListBullet2"/>
+      </w:pPr>
+      <w:r>
+        <w:t>SDA/SCL: I2C インターフェース</w:t>
+      </w:r>
+    </w:p>
+    <w:p>
+      <w:pPr>
+        <w:pStyle w:val="ListBullet2"/>
+      </w:pPr>
+      <w:r>
+        <w:t>XA/XB: クリスタル接続</w:t>
+      </w:r>
+    </w:p>
+    <w:p>
+      <w:pPr>
+        <w:pStyle w:val="ListBullet2"/>
+      </w:pPr>
+      <w:r>
+        <w:t>VDDA/VCCIO: 電源</w:t>
+      </w:r>
+    </w:p>
+    <w:p>
+      <w:pPr>
+        <w:pStyle w:val="Heading3"/>
+      </w:pPr>
+      <w:r>
+        <w:t>3.3 Si5351 DIP-8 モジュール</w:t>
+      </w:r>
+    </w:p>
+    <w:p>
+      <w:r>
+        <w:rPr>
+          <w:b/>
+        </w:rPr>
+        <w:t xml:space="preserve">シンボル: </w:t>
+      </w:r>
+      <w:r>
+        <w:t>Si5351_DIP8.kicad_sym (1.5倍拡大)</w:t>
+        <w:br/>
+      </w:r>
+      <w:r>
+        <w:rPr>
+          <w:b/>
+        </w:rPr>
+        <w:t xml:space="preserve">フットプリント: </w:t>
+      </w:r>
+      <w:r>
+        <w:t>DIP-8_W7.62mm.kicad_mod</w:t>
+        <w:br/>
+      </w:r>
+      <w:r>
+        <w:rPr>
+          <w:b/>
+        </w:rPr>
+        <w:t xml:space="preserve">パッケージ: </w:t>
+      </w:r>
+      <w:r>
+        <w:t>DIP-8 (7.62mm ピッチ)</w:t>
+        <w:br/>
+      </w:r>
+    </w:p>
+    <w:p>
+      <w:r>
+        <w:t>ピン配置:</w:t>
+      </w:r>
+    </w:p>
+    <w:tbl>
+      <w:tblPr>
+        <w:tblStyle w:val="LightGrid-Accent1"/>
+        <w:tblW w:type="auto" w:w="0"/>
+        <w:tblLook w:firstColumn="1" w:firstRow="1" w:lastColumn="0" w:lastRow="0" w:noHBand="0" w:noVBand="1" w:val="04A0"/>
+      </w:tblPr>
+      <w:tblGrid>
+        <w:gridCol w:w="4536"/>
+        <w:gridCol w:w="4536"/>
+      </w:tblGrid>
+      <w:tr>
+        <w:tc>
+          <w:tcPr>
+            <w:tcW w:type="dxa" w:w="4536"/>
+          </w:tcPr>
+          <w:p>
+            <w:r>
+              <w:t>ピン番号</w:t>
+            </w:r>
+          </w:p>
+        </w:tc>
+        <w:tc>
+          <w:tcPr>
+            <w:tcW w:type="dxa" w:w="4536"/>
+          </w:tcPr>
+          <w:p>
+            <w:r>
+              <w:t>機能</w:t>
+            </w:r>
+          </w:p>
+        </w:tc>
+      </w:tr>
+      <w:tr>
+        <w:tc>
+          <w:tcPr>
+            <w:tcW w:type="dxa" w:w="4536"/>
+          </w:tcPr>
+          <w:p>
+            <w:r>
+              <w:t>1</w:t>
+            </w:r>
+          </w:p>
+        </w:tc>
+        <w:tc>
+          <w:tcPr>
+            <w:tcW w:type="dxa" w:w="4536"/>
+          </w:tcPr>
+          <w:p>
+            <w:r>
+              <w:t>VDDO - 出力バッファ用電源</w:t>
+            </w:r>
+          </w:p>
+        </w:tc>
+      </w:tr>
+      <w:tr>
+        <w:tc>
+          <w:tcPr>
+            <w:tcW w:type="dxa" w:w="4536"/>
+          </w:tcPr>
+          <w:p>
+            <w:r>
+              <w:t>2</w:t>
+            </w:r>
+          </w:p>
+        </w:tc>
+        <w:tc>
+          <w:tcPr>
+            <w:tcW w:type="dxa" w:w="4536"/>
+          </w:tcPr>
+          <w:p>
+            <w:r>
+              <w:t>SCL - I2C クロック入力</w:t>
+            </w:r>
+          </w:p>
+        </w:tc>
+      </w:tr>
+      <w:tr>
+        <w:tc>
+          <w:tcPr>
+            <w:tcW w:type="dxa" w:w="4536"/>
+          </w:tcPr>
+          <w:p>
+            <w:r>
+              <w:t>3</w:t>
+            </w:r>
+          </w:p>
+        </w:tc>
+        <w:tc>
+          <w:tcPr>
+            <w:tcW w:type="dxa" w:w="4536"/>
+          </w:tcPr>
+          <w:p>
+            <w:r>
+              <w:t>SDA - I2C データ入出力</w:t>
+            </w:r>
+          </w:p>
+        </w:tc>
+      </w:tr>
+      <w:tr>
+        <w:tc>
+          <w:tcPr>
+            <w:tcW w:type="dxa" w:w="4536"/>
+          </w:tcPr>
+          <w:p>
+            <w:r>
+              <w:t>4</w:t>
+            </w:r>
+          </w:p>
+        </w:tc>
+        <w:tc>
+          <w:tcPr>
+            <w:tcW w:type="dxa" w:w="4536"/>
+          </w:tcPr>
+          <w:p>
+            <w:r>
+              <w:t>GND - グラウンド</w:t>
+            </w:r>
+          </w:p>
+        </w:tc>
+      </w:tr>
+    </w:tbl>
+    <w:p>
+      <w:r>
+        <w:t>ピン配置（続き）:</w:t>
+      </w:r>
+    </w:p>
+    <w:tbl>
+      <w:tblPr>
+        <w:tblStyle w:val="LightGrid-Accent1"/>
+        <w:tblW w:type="auto" w:w="0"/>
+        <w:tblLook w:firstColumn="1" w:firstRow="1" w:lastColumn="0" w:lastRow="0" w:noHBand="0" w:noVBand="1" w:val="04A0"/>
+      </w:tblPr>
+      <w:tblGrid>
+        <w:gridCol w:w="4536"/>
+        <w:gridCol w:w="4536"/>
+      </w:tblGrid>
+      <w:tr>
+        <w:tc>
+          <w:tcPr>
+            <w:tcW w:type="dxa" w:w="4536"/>
+          </w:tcPr>
+          <w:p>
+            <w:r>
+              <w:t>ピン番号</w:t>
+            </w:r>
+          </w:p>
+        </w:tc>
+        <w:tc>
+          <w:tcPr>
+            <w:tcW w:type="dxa" w:w="4536"/>
+          </w:tcPr>
+          <w:p>
+            <w:r>
+              <w:t>機能</w:t>
+            </w:r>
+          </w:p>
+        </w:tc>
+      </w:tr>
+      <w:tr>
+        <w:tc>
+          <w:tcPr>
+            <w:tcW w:type="dxa" w:w="4536"/>
+          </w:tcPr>
+          <w:p>
+            <w:r>
+              <w:t>5</w:t>
+            </w:r>
+          </w:p>
+        </w:tc>
+        <w:tc>
+          <w:tcPr>
+            <w:tcW w:type="dxa" w:w="4536"/>
+          </w:tcPr>
+          <w:p>
+            <w:r>
+              <w:t>CLK0 - クロック出力 1</w:t>
+            </w:r>
+          </w:p>
+        </w:tc>
+      </w:tr>
+      <w:tr>
+        <w:tc>
+          <w:tcPr>
+            <w:tcW w:type="dxa" w:w="4536"/>
+          </w:tcPr>
+          <w:p>
+            <w:r>
+              <w:t>6</w:t>
+            </w:r>
+          </w:p>
+        </w:tc>
+        <w:tc>
+          <w:tcPr>
+            <w:tcW w:type="dxa" w:w="4536"/>
+          </w:tcPr>
+          <w:p>
+            <w:r>
+              <w:t>CLK1 - クロック出力 2</w:t>
+            </w:r>
+          </w:p>
+        </w:tc>
+      </w:tr>
+      <w:tr>
+        <w:tc>
+          <w:tcPr>
+            <w:tcW w:type="dxa" w:w="4536"/>
+          </w:tcPr>
+          <w:p>
+            <w:r>
+              <w:t>7</w:t>
+            </w:r>
+          </w:p>
+        </w:tc>
+        <w:tc>
+          <w:tcPr>
+            <w:tcW w:type="dxa" w:w="4536"/>
+          </w:tcPr>
+          <w:p>
+            <w:r>
+              <w:t>CLK2 - クロック出力 3</w:t>
+            </w:r>
+          </w:p>
+        </w:tc>
+      </w:tr>
+      <w:tr>
+        <w:tc>
+          <w:tcPr>
+            <w:tcW w:type="dxa" w:w="4536"/>
+          </w:tcPr>
+          <w:p>
+            <w:r>
+              <w:t>8</w:t>
+            </w:r>
+          </w:p>
+        </w:tc>
+        <w:tc>
+          <w:tcPr>
+            <w:tcW w:type="dxa" w:w="4536"/>
+          </w:tcPr>
+          <w:p>
+            <w:r>
+              <w:t>VDD - コア電源入力</w:t>
+            </w:r>
+          </w:p>
+        </w:tc>
+      </w:tr>
+    </w:tbl>
+    <w:p>
+      <w:pPr>
+        <w:pStyle w:val="Heading2"/>
+      </w:pPr>
+      <w:r>
+        <w:t>4. KiCad ライブラリ統合</w:t>
+      </w:r>
+    </w:p>
+    <w:p>
+      <w:r>
+        <w:t>sym-lib-table（シンボルライブラリ）に以下を登録:</w:t>
+      </w:r>
+    </w:p>
+    <w:p>
+      <w:pPr>
+        <w:pStyle w:val="ListBullet"/>
+      </w:pPr>
+      <w:r>
+        <w:t>PSN_TRX - プロジェクト用カスタムシンボル</w:t>
+      </w:r>
+    </w:p>
+    <w:p>
+      <w:pPr>
+        <w:pStyle w:val="ListBullet"/>
+      </w:pPr>
+      <w:r>
+        <w:t>Arduino_Nano_R4 - Arduino Nano R4 シンボル</w:t>
+      </w:r>
+    </w:p>
+    <w:p>
+      <w:pPr>
+        <w:pStyle w:val="ListBullet"/>
+      </w:pPr>
+      <w:r>
+        <w:t>Si5351A - Si5351A QFN-20 シンボル</w:t>
+      </w:r>
+    </w:p>
+    <w:p>
+      <w:pPr>
+        <w:pStyle w:val="ListBullet"/>
+      </w:pPr>
+      <w:r>
+        <w:t>Si5351_DIP8 - Si5351 DIP-8 モジュールシンボル</w:t>
+      </w:r>
+    </w:p>
+    <w:p>
+      <w:pPr>
+        <w:pStyle w:val="ListBullet"/>
+      </w:pPr>
+      <w:r>
+        <w:t>Arduino - Arduino 公式ボードライブラリ</w:t>
+      </w:r>
+    </w:p>
+    <w:p>
+      <w:r>
+        <w:br/>
+        <w:t>fp-lib-table（フットプリントライブラリ）に以下を登録:</w:t>
+      </w:r>
+    </w:p>
+    <w:p>
+      <w:pPr>
+        <w:pStyle w:val="ListBullet"/>
+      </w:pPr>
+      <w:r>
+        <w:t>PSN_TRX.pretty - プロジェクト用フットプリント</w:t>
+      </w:r>
+    </w:p>
+    <w:p>
+      <w:pPr>
+        <w:pStyle w:val="ListBullet"/>
+      </w:pPr>
+      <w:r>
+        <w:t>Arduino - Arduino 公式フットプリント</w:t>
+      </w:r>
+    </w:p>
+    <w:p>
+      <w:pPr>
+        <w:pStyle w:val="Heading2"/>
+      </w:pPr>
+      <w:r>
+        <w:t>5. 作成・更新ファイル一覧</w:t>
+      </w:r>
+    </w:p>
+    <w:p>
+      <w:r>
+        <w:t>シンボルファイル:</w:t>
+      </w:r>
+    </w:p>
+    <w:p>
+      <w:pPr>
+        <w:pStyle w:val="ListBullet"/>
+      </w:pPr>
+      <w:r>
+        <w:t>Arduino_Nano_R4.kicad_sym (7.2 KB)</w:t>
+      </w:r>
+    </w:p>
+    <w:p>
+      <w:pPr>
+        <w:pStyle w:val="ListBullet"/>
+      </w:pPr>
+      <w:r>
+        <w:t>Si5351A.kicad_sym (5.2 KB)</w:t>
+      </w:r>
+    </w:p>
+    <w:p>
+      <w:pPr>
+        <w:pStyle w:val="ListBullet"/>
+      </w:pPr>
+      <w:r>
+        <w:t>Si5351_DIP8.kicad_sym (2.8 KB)</w:t>
+      </w:r>
+    </w:p>
+    <w:p>
+      <w:r>
+        <w:br/>
+        <w:t>フットプリントファイル:</w:t>
+      </w:r>
+    </w:p>
+    <w:p>
+      <w:pPr>
+        <w:pStyle w:val="ListBullet"/>
+      </w:pPr>
+      <w:r>
+        <w:t>Arduino_Nano_R4_Socket.kicad_mod (4.4 KB)</w:t>
+      </w:r>
+    </w:p>
+    <w:p>
+      <w:pPr>
+        <w:pStyle w:val="ListBullet"/>
+      </w:pPr>
+      <w:r>
+        <w:t>Si5351A_QFN-20.kicad_mod (3.0 KB)</w:t>
+      </w:r>
+    </w:p>
+    <w:p>
+      <w:pPr>
+        <w:pStyle w:val="ListBullet"/>
+      </w:pPr>
+      <w:r>
+        <w:t>DIP-8_W7.62mm.kicad_mod (2.0 KB)</w:t>
       </w:r>
     </w:p>
     <w:sectPr>

</xml_diff>

<commit_message>
Update docx: replace ESP32 terms with Arduino Nano R4
Co-Authored-By: Claude Sonnet 4.6 <noreply@anthropic.com>
</commit_message>
<xml_diff>
--- a/docs/PSN_TRX_VFO改造仕様書.docx
+++ b/docs/PSN_TRX_VFO改造仕様書.docx
@@ -4424,7 +4424,7 @@
     </w:p>
     <w:p>
       <w:r>
-        <w:t>PSN_TRX_ESP32 プロジェクトを Arduino Nano R4（ルネサス RA4M1 ベース）に移植しました。</w:t>
+        <w:t>PSN_TRX_Arduino Nano R4 プロジェクトを Arduino Nano R4（ルネサス RA4M1 ベース）に移植しました。</w:t>
       </w:r>
     </w:p>
     <w:p>
@@ -4437,7 +4437,7 @@
         <w:pStyle w:val="ListBullet"/>
       </w:pPr>
       <w:r>
-        <w:t>マイコン: ESP32 → Arduino Nano R4 (Renesas RA4M1, 48MHz)</w:t>
+        <w:t>マイコン: Arduino Nano R4 → Arduino Nano R4 (Renesas RA4M1, 48MHz)</w:t>
       </w:r>
     </w:p>
     <w:p>
@@ -4453,7 +4453,7 @@
         <w:pStyle w:val="ListBullet"/>
       </w:pPr>
       <w:r>
-        <w:t>ストレージ: Preferences (NVS) → EEPROM</w:t>
+        <w:t>ストレージ: EEPROM (EEPROM) → EEPROM</w:t>
       </w:r>
     </w:p>
     <w:p>
@@ -4474,7 +4474,7 @@
     </w:p>
     <w:p>
       <w:r>
-        <w:t>ESP32 から Arduino Nano R4 への変更:</w:t>
+        <w:t>Arduino Nano R4 から Arduino Nano R4 への変更:</w:t>
       </w:r>
     </w:p>
     <w:tbl>
@@ -4505,7 +4505,7 @@
           </w:tcPr>
           <w:p>
             <w:r>
-              <w:t>ESP32</w:t>
+              <w:t>Arduino Nano R4</w:t>
             </w:r>
           </w:p>
         </w:tc>
@@ -4537,7 +4537,7 @@
           </w:tcPr>
           <w:p>
             <w:r>
-              <w:t>GPIO21</w:t>
+              <w:t>A4</w:t>
             </w:r>
           </w:p>
         </w:tc>
@@ -4569,7 +4569,7 @@
           </w:tcPr>
           <w:p>
             <w:r>
-              <w:t>GPIO22</w:t>
+              <w:t>A5</w:t>
             </w:r>
           </w:p>
         </w:tc>
@@ -4601,7 +4601,7 @@
           </w:tcPr>
           <w:p>
             <w:r>
-              <w:t>GPIO32</w:t>
+              <w:t>D2</w:t>
             </w:r>
           </w:p>
         </w:tc>
@@ -4633,7 +4633,7 @@
           </w:tcPr>
           <w:p>
             <w:r>
-              <w:t>GPIO33</w:t>
+              <w:t>D3</w:t>
             </w:r>
           </w:p>
         </w:tc>
@@ -4665,7 +4665,7 @@
           </w:tcPr>
           <w:p>
             <w:r>
-              <w:t>GPIO25</w:t>
+              <w:t>D4</w:t>
             </w:r>
           </w:p>
         </w:tc>
@@ -5293,7 +5293,7 @@
     </w:p>
     <w:p>
       <w:r>
-        <w:t>PSN_TRX_ESP32 プロジェクトを Arduino Nano R4（ルネサス RA4M1 ベース）に移植しました。</w:t>
+        <w:t>PSN_TRX_Arduino Nano R4 プロジェクトを Arduino Nano R4（ルネサス RA4M1 ベース）に移植しました。</w:t>
       </w:r>
     </w:p>
     <w:p>
@@ -5306,7 +5306,7 @@
         <w:pStyle w:val="ListBullet"/>
       </w:pPr>
       <w:r>
-        <w:t>マイコン: ESP32 → Arduino Nano R4 (Renesas RA4M1, 48MHz)</w:t>
+        <w:t>マイコン: Arduino Nano R4 → Arduino Nano R4 (Renesas RA4M1, 48MHz)</w:t>
       </w:r>
     </w:p>
     <w:p>
@@ -5322,7 +5322,7 @@
         <w:pStyle w:val="ListBullet"/>
       </w:pPr>
       <w:r>
-        <w:t>ストレージ: Preferences (NVS) → EEPROM</w:t>
+        <w:t>ストレージ: EEPROM (EEPROM) → EEPROM</w:t>
       </w:r>
     </w:p>
     <w:p>
@@ -5343,7 +5343,7 @@
     </w:p>
     <w:p>
       <w:r>
-        <w:t>ESP32 から Arduino Nano R4 への変更:</w:t>
+        <w:t>Arduino Nano R4 から Arduino Nano R4 への変更:</w:t>
       </w:r>
     </w:p>
     <w:tbl>
@@ -5374,7 +5374,7 @@
           </w:tcPr>
           <w:p>
             <w:r>
-              <w:t>ESP32</w:t>
+              <w:t>Arduino Nano R4</w:t>
             </w:r>
           </w:p>
         </w:tc>
@@ -5406,7 +5406,7 @@
           </w:tcPr>
           <w:p>
             <w:r>
-              <w:t>GPIO21</w:t>
+              <w:t>A4</w:t>
             </w:r>
           </w:p>
         </w:tc>
@@ -5438,7 +5438,7 @@
           </w:tcPr>
           <w:p>
             <w:r>
-              <w:t>GPIO22</w:t>
+              <w:t>A5</w:t>
             </w:r>
           </w:p>
         </w:tc>
@@ -5470,7 +5470,7 @@
           </w:tcPr>
           <w:p>
             <w:r>
-              <w:t>GPIO32</w:t>
+              <w:t>D2</w:t>
             </w:r>
           </w:p>
         </w:tc>
@@ -5502,7 +5502,7 @@
           </w:tcPr>
           <w:p>
             <w:r>
-              <w:t>GPIO33</w:t>
+              <w:t>D3</w:t>
             </w:r>
           </w:p>
         </w:tc>
@@ -5534,7 +5534,7 @@
           </w:tcPr>
           <w:p>
             <w:r>
-              <w:t>GPIO25</w:t>
+              <w:t>D4</w:t>
             </w:r>
           </w:p>
         </w:tc>

</xml_diff>